<commit_message>
RF-3309: BRD review round — real confirmation component, display locations, History of Change
SC4 rebuilt to the live Edit confirmation component (centered message,
No / Yes, Save) with professionalised wording; section 4 states the
display location and the Application Enquiry impact; the two unnecessary
impact rows (Documents diagram, Status model) removed; History of Change
added (V1.0, 30 September 2026, Hailey (Appro)); US AC2.2/AC6 aligned.

Co-Authored-By: Claude Fable 5 <noreply@anthropic.com>
Claude-Session: https://claude.ai/code/session_01DpzepkLYwCzujeEtvjJxcF
</commit_message>
<xml_diff>
--- a/docs/brd/RF-3309/Appro_RF_Employer_Name_Edit_in_Credit_Queue_v1.0.docx
+++ b/docs/brd/RF-3309/Appro_RF_Employer_Name_Edit_in_Credit_Queue_v1.0.docx
@@ -110,7 +110,7 @@
           <w:sz w:val="22"/>
           <w:szCs w:val="22"/>
         </w:rPr>
-        <w:t xml:space="preserve">29 September 2026</w:t>
+        <w:t xml:space="preserve">30 September 2026</w:t>
       </w:r>
     </w:p>
     <w:p>
@@ -268,6 +268,290 @@
           <w:sz w:val="26"/>
           <w:szCs w:val="26"/>
         </w:rPr>
+        <w:t xml:space="preserve">HISTORY OF CHANGE</w:t>
+      </w:r>
+    </w:p>
+    <w:tbl>
+      <w:tblPr>
+        <w:tblW w:type="dxa" w:w="9026"/>
+        <w:tblBorders>
+          <w:top w:val="single" w:color="A6A6A6" w:sz="4"/>
+          <w:left w:val="single" w:color="A6A6A6" w:sz="4"/>
+          <w:bottom w:val="single" w:color="A6A6A6" w:sz="4"/>
+          <w:right w:val="single" w:color="A6A6A6" w:sz="4"/>
+          <w:insideH w:val="single" w:color="A6A6A6" w:sz="4"/>
+          <w:insideV w:val="single" w:color="A6A6A6" w:sz="4"/>
+        </w:tblBorders>
+      </w:tblPr>
+      <w:tblGrid>
+        <w:gridCol w:w="1083"/>
+        <w:gridCol w:w="2166"/>
+        <w:gridCol w:w="1986"/>
+        <w:gridCol w:w="3791"/>
+      </w:tblGrid>
+      <w:tr>
+        <w:trPr>
+          <w:cantSplit/>
+          <w:tblHeader/>
+        </w:trPr>
+        <w:tc>
+          <w:tcPr>
+            <w:tcW w:type="dxa" w:w="1083"/>
+            <w:shd w:fill="156082" w:color="auto" w:val="clear"/>
+            <w:tcMar>
+              <w:top w:type="dxa" w:w="90"/>
+              <w:left w:type="dxa" w:w="110"/>
+              <w:bottom w:type="dxa" w:w="90"/>
+              <w:right w:type="dxa" w:w="110"/>
+            </w:tcMar>
+            <w:vAlign w:val="top"/>
+          </w:tcPr>
+          <w:p>
+            <w:pPr>
+              <w:spacing w:after="0" w:before="0" w:line="252"/>
+            </w:pPr>
+            <w:r>
+              <w:rPr>
+                <w:rFonts w:ascii="Arial" w:cs="Arial" w:eastAsia="Arial" w:hAnsi="Arial"/>
+                <w:b/>
+                <w:bCs/>
+                <w:color w:val="FFFFFF"/>
+                <w:sz w:val="21"/>
+                <w:szCs w:val="21"/>
+              </w:rPr>
+              <w:t xml:space="preserve">Version</w:t>
+            </w:r>
+          </w:p>
+        </w:tc>
+        <w:tc>
+          <w:tcPr>
+            <w:tcW w:type="dxa" w:w="2166"/>
+            <w:shd w:fill="156082" w:color="auto" w:val="clear"/>
+            <w:tcMar>
+              <w:top w:type="dxa" w:w="90"/>
+              <w:left w:type="dxa" w:w="110"/>
+              <w:bottom w:type="dxa" w:w="90"/>
+              <w:right w:type="dxa" w:w="110"/>
+            </w:tcMar>
+            <w:vAlign w:val="top"/>
+          </w:tcPr>
+          <w:p>
+            <w:pPr>
+              <w:spacing w:after="0" w:before="0" w:line="252"/>
+            </w:pPr>
+            <w:r>
+              <w:rPr>
+                <w:rFonts w:ascii="Arial" w:cs="Arial" w:eastAsia="Arial" w:hAnsi="Arial"/>
+                <w:b/>
+                <w:bCs/>
+                <w:color w:val="FFFFFF"/>
+                <w:sz w:val="21"/>
+                <w:szCs w:val="21"/>
+              </w:rPr>
+              <w:t xml:space="preserve">Date</w:t>
+            </w:r>
+          </w:p>
+        </w:tc>
+        <w:tc>
+          <w:tcPr>
+            <w:tcW w:type="dxa" w:w="1986"/>
+            <w:shd w:fill="156082" w:color="auto" w:val="clear"/>
+            <w:tcMar>
+              <w:top w:type="dxa" w:w="90"/>
+              <w:left w:type="dxa" w:w="110"/>
+              <w:bottom w:type="dxa" w:w="90"/>
+              <w:right w:type="dxa" w:w="110"/>
+            </w:tcMar>
+            <w:vAlign w:val="top"/>
+          </w:tcPr>
+          <w:p>
+            <w:pPr>
+              <w:spacing w:after="0" w:before="0" w:line="252"/>
+            </w:pPr>
+            <w:r>
+              <w:rPr>
+                <w:rFonts w:ascii="Arial" w:cs="Arial" w:eastAsia="Arial" w:hAnsi="Arial"/>
+                <w:b/>
+                <w:bCs/>
+                <w:color w:val="FFFFFF"/>
+                <w:sz w:val="21"/>
+                <w:szCs w:val="21"/>
+              </w:rPr>
+              <w:t xml:space="preserve">Author</w:t>
+            </w:r>
+          </w:p>
+        </w:tc>
+        <w:tc>
+          <w:tcPr>
+            <w:tcW w:type="dxa" w:w="3791"/>
+            <w:shd w:fill="156082" w:color="auto" w:val="clear"/>
+            <w:tcMar>
+              <w:top w:type="dxa" w:w="90"/>
+              <w:left w:type="dxa" w:w="110"/>
+              <w:bottom w:type="dxa" w:w="90"/>
+              <w:right w:type="dxa" w:w="110"/>
+            </w:tcMar>
+            <w:vAlign w:val="top"/>
+          </w:tcPr>
+          <w:p>
+            <w:pPr>
+              <w:spacing w:after="0" w:before="0" w:line="252"/>
+            </w:pPr>
+            <w:r>
+              <w:rPr>
+                <w:rFonts w:ascii="Arial" w:cs="Arial" w:eastAsia="Arial" w:hAnsi="Arial"/>
+                <w:b/>
+                <w:bCs/>
+                <w:color w:val="FFFFFF"/>
+                <w:sz w:val="21"/>
+                <w:szCs w:val="21"/>
+              </w:rPr>
+              <w:t xml:space="preserve">Description</w:t>
+            </w:r>
+          </w:p>
+        </w:tc>
+      </w:tr>
+      <w:tr>
+        <w:trPr>
+          <w:cantSplit/>
+        </w:trPr>
+        <w:tc>
+          <w:tcPr>
+            <w:tcW w:type="dxa" w:w="1083"/>
+            <w:shd w:fill="FFFFFF" w:color="auto" w:val="clear"/>
+            <w:tcMar>
+              <w:top w:type="dxa" w:w="90"/>
+              <w:left w:type="dxa" w:w="110"/>
+              <w:bottom w:type="dxa" w:w="90"/>
+              <w:right w:type="dxa" w:w="110"/>
+            </w:tcMar>
+            <w:vAlign w:val="top"/>
+          </w:tcPr>
+          <w:p>
+            <w:pPr>
+              <w:spacing w:after="0" w:before="0" w:line="252"/>
+            </w:pPr>
+            <w:r>
+              <w:rPr>
+                <w:rFonts w:ascii="Arial" w:cs="Arial" w:eastAsia="Arial" w:hAnsi="Arial"/>
+                <w:b w:val="false"/>
+                <w:bCs w:val="false"/>
+                <w:color w:val="000000"/>
+                <w:sz w:val="21"/>
+                <w:szCs w:val="21"/>
+              </w:rPr>
+              <w:t xml:space="preserve">1.0</w:t>
+            </w:r>
+          </w:p>
+        </w:tc>
+        <w:tc>
+          <w:tcPr>
+            <w:tcW w:type="dxa" w:w="2166"/>
+            <w:shd w:fill="FFFFFF" w:color="auto" w:val="clear"/>
+            <w:tcMar>
+              <w:top w:type="dxa" w:w="90"/>
+              <w:left w:type="dxa" w:w="110"/>
+              <w:bottom w:type="dxa" w:w="90"/>
+              <w:right w:type="dxa" w:w="110"/>
+            </w:tcMar>
+            <w:vAlign w:val="top"/>
+          </w:tcPr>
+          <w:p>
+            <w:pPr>
+              <w:spacing w:after="0" w:before="0" w:line="252"/>
+            </w:pPr>
+            <w:r>
+              <w:rPr>
+                <w:rFonts w:ascii="Arial" w:cs="Arial" w:eastAsia="Arial" w:hAnsi="Arial"/>
+                <w:b w:val="false"/>
+                <w:bCs w:val="false"/>
+                <w:color w:val="000000"/>
+                <w:sz w:val="21"/>
+                <w:szCs w:val="21"/>
+              </w:rPr>
+              <w:t xml:space="preserve">30 September 2026</w:t>
+            </w:r>
+          </w:p>
+        </w:tc>
+        <w:tc>
+          <w:tcPr>
+            <w:tcW w:type="dxa" w:w="1986"/>
+            <w:shd w:fill="FFFFFF" w:color="auto" w:val="clear"/>
+            <w:tcMar>
+              <w:top w:type="dxa" w:w="90"/>
+              <w:left w:type="dxa" w:w="110"/>
+              <w:bottom w:type="dxa" w:w="90"/>
+              <w:right w:type="dxa" w:w="110"/>
+            </w:tcMar>
+            <w:vAlign w:val="top"/>
+          </w:tcPr>
+          <w:p>
+            <w:pPr>
+              <w:spacing w:after="0" w:before="0" w:line="252"/>
+            </w:pPr>
+            <w:r>
+              <w:rPr>
+                <w:rFonts w:ascii="Arial" w:cs="Arial" w:eastAsia="Arial" w:hAnsi="Arial"/>
+                <w:b w:val="false"/>
+                <w:bCs w:val="false"/>
+                <w:color w:val="000000"/>
+                <w:sz w:val="21"/>
+                <w:szCs w:val="21"/>
+              </w:rPr>
+              <w:t xml:space="preserve">Hailey (Appro)</w:t>
+            </w:r>
+          </w:p>
+        </w:tc>
+        <w:tc>
+          <w:tcPr>
+            <w:tcW w:type="dxa" w:w="3791"/>
+            <w:shd w:fill="FFFFFF" w:color="auto" w:val="clear"/>
+            <w:tcMar>
+              <w:top w:type="dxa" w:w="90"/>
+              <w:left w:type="dxa" w:w="110"/>
+              <w:bottom w:type="dxa" w:w="90"/>
+              <w:right w:type="dxa" w:w="110"/>
+            </w:tcMar>
+            <w:vAlign w:val="top"/>
+          </w:tcPr>
+          <w:p>
+            <w:pPr>
+              <w:spacing w:after="0" w:before="0" w:line="252"/>
+            </w:pPr>
+            <w:r>
+              <w:rPr>
+                <w:rFonts w:ascii="Arial" w:cs="Arial" w:eastAsia="Arial" w:hAnsi="Arial"/>
+                <w:b w:val="false"/>
+                <w:bCs w:val="false"/>
+                <w:color w:val="000000"/>
+                <w:sz w:val="21"/>
+                <w:szCs w:val="21"/>
+              </w:rPr>
+              <w:t xml:space="preserve">Initial version</w:t>
+            </w:r>
+          </w:p>
+        </w:tc>
+      </w:tr>
+    </w:tbl>
+    <w:p>
+      <w:pPr>
+        <w:spacing w:after="200"/>
+      </w:pPr>
+    </w:p>
+    <w:p>
+      <w:pPr>
+        <w:pStyle w:val="Heading1"/>
+        <w:spacing w:after="140" w:before="300"/>
+      </w:pPr>
+      <w:r>
+        <w:rPr>
+          <w:rFonts w:ascii="Arial" w:cs="Arial" w:eastAsia="Arial" w:hAnsi="Arial"/>
+          <w:b/>
+          <w:bCs/>
+          <w:color w:val="000000"/>
+          <w:sz w:val="26"/>
+          <w:szCs w:val="26"/>
+        </w:rPr>
         <w:t xml:space="preserve">EMPLOYER NAME EDIT IN CREDIT QUEUE</w:t>
       </w:r>
     </w:p>
@@ -2293,7 +2577,7 @@
           <w:sz w:val="22"/>
           <w:szCs w:val="22"/>
         </w:rPr>
-        <w:t xml:space="preserve">When the user clicks Save, the standard confirmation is shown for the whole pop-up — </w:t>
+        <w:t xml:space="preserve">When the user clicks Save, the existing Edit confirmation component is shown once for the whole pop-up (centered message, No / Yes, Save buttons): </w:t>
       </w:r>
       <w:r>
         <w:rPr>
@@ -2304,51 +2588,7 @@
           <w:sz w:val="22"/>
           <w:szCs w:val="22"/>
         </w:rPr>
-        <w:t xml:space="preserve">'Are you sure you want to update this &lt;Application ID&gt;?'</w:t>
-      </w:r>
-      <w:r>
-        <w:rPr>
-          <w:rFonts w:ascii="Arial" w:cs="Arial" w:eastAsia="Arial" w:hAnsi="Arial"/>
-          <w:b w:val="false"/>
-          <w:bCs w:val="false"/>
-          <w:color w:val="000000"/>
-          <w:sz w:val="22"/>
-          <w:szCs w:val="22"/>
-        </w:rPr>
-        <w:t xml:space="preserve"> — with the sub-text </w:t>
-      </w:r>
-      <w:r>
-        <w:rPr>
-          <w:rFonts w:ascii="Arial" w:cs="Arial" w:eastAsia="Arial" w:hAnsi="Arial"/>
-          <w:i/>
-          <w:iCs/>
-          <w:color w:val="000000"/>
-          <w:sz w:val="22"/>
-          <w:szCs w:val="22"/>
-        </w:rPr>
-        <w:t xml:space="preserve">Company Name will change from "&lt;current&gt;" to "&lt;new&gt;"</w:t>
-      </w:r>
-      <w:r>
-        <w:rPr>
-          <w:rFonts w:ascii="Arial" w:cs="Arial" w:eastAsia="Arial" w:hAnsi="Arial"/>
-          <w:b w:val="false"/>
-          <w:bCs w:val="false"/>
-          <w:color w:val="000000"/>
-          <w:sz w:val="22"/>
-          <w:szCs w:val="22"/>
-        </w:rPr>
-        <w:t xml:space="preserve"> and the note </w:t>
-      </w:r>
-      <w:r>
-        <w:rPr>
-          <w:rFonts w:ascii="Arial" w:cs="Arial" w:eastAsia="Arial" w:hAnsi="Arial"/>
-          <w:i/>
-          <w:iCs/>
-          <w:color w:val="000000"/>
-          <w:sz w:val="22"/>
-          <w:szCs w:val="22"/>
-        </w:rPr>
-        <w:t xml:space="preserve">'Note that the system will re-run the ALOC classification, auto-recalculate the related fields and then re-run the Rule Engine. Please choose carefully!'</w:t>
+        <w:t xml:space="preserve">'Are you sure you want to update this &lt;Application ID&gt;? Company Name will change from "&lt;current&gt;" to "&lt;new&gt;". The system will re-run the ALOC classification, recalculate the related fields and re-run the Rule Engine.'</w:t>
       </w:r>
     </w:p>
     <w:p>
@@ -2425,7 +2665,7 @@
           <w:sz w:val="22"/>
           <w:szCs w:val="22"/>
         </w:rPr>
-        <w:t xml:space="preserve">On 'Yes', the system executes in order:</w:t>
+        <w:t xml:space="preserve">On 'Yes, Save', the system executes in order:</w:t>
       </w:r>
     </w:p>
     <w:tbl>
@@ -3090,7 +3330,29 @@
           <w:sz w:val="22"/>
           <w:szCs w:val="22"/>
         </w:rPr>
-        <w:t xml:space="preserve">Application Details › </w:t>
+        <w:t xml:space="preserve">The fields below sit in the expanded </w:t>
+      </w:r>
+      <w:r>
+        <w:rPr>
+          <w:rFonts w:ascii="Arial" w:cs="Arial" w:eastAsia="Arial" w:hAnsi="Arial"/>
+          <w:b/>
+          <w:bCs/>
+          <w:color w:val="000000"/>
+          <w:sz w:val="22"/>
+          <w:szCs w:val="22"/>
+        </w:rPr>
+        <w:t xml:space="preserve">Application Details</w:t>
+      </w:r>
+      <w:r>
+        <w:rPr>
+          <w:rFonts w:ascii="Arial" w:cs="Arial" w:eastAsia="Arial" w:hAnsi="Arial"/>
+          <w:b w:val="false"/>
+          <w:bCs w:val="false"/>
+          <w:color w:val="000000"/>
+          <w:sz w:val="22"/>
+          <w:szCs w:val="22"/>
+        </w:rPr>
+        <w:t xml:space="preserve"> section › </w:t>
       </w:r>
       <w:r>
         <w:rPr>
@@ -3112,7 +3374,29 @@
           <w:sz w:val="22"/>
           <w:szCs w:val="22"/>
         </w:rPr>
-        <w:t xml:space="preserve"> (Credit Queue, Risk / Sale / Compliance queues and Application Enquiry) shows the full picture — the Edit pop-up carries only the editable field:</w:t>
+        <w:t xml:space="preserve"> sub-block of the application view. The same section is shown in </w:t>
+      </w:r>
+      <w:r>
+        <w:rPr>
+          <w:rFonts w:ascii="Arial" w:cs="Arial" w:eastAsia="Arial" w:hAnsi="Arial"/>
+          <w:b/>
+          <w:bCs/>
+          <w:color w:val="000000"/>
+          <w:sz w:val="22"/>
+          <w:szCs w:val="22"/>
+        </w:rPr>
+        <w:t xml:space="preserve">Credit Queue L1–L3, Risk Queue, Sale Queue, Compliance Queue and Application Enquiry</w:t>
+      </w:r>
+      <w:r>
+        <w:rPr>
+          <w:rFonts w:ascii="Arial" w:cs="Arial" w:eastAsia="Arial" w:hAnsi="Arial"/>
+          <w:b w:val="false"/>
+          <w:bCs w:val="false"/>
+          <w:color w:val="000000"/>
+          <w:sz w:val="22"/>
+          <w:szCs w:val="22"/>
+        </w:rPr>
+        <w:t xml:space="preserve"> (view only) — the Edit pop-up carries only the editable field; the full picture is view-only here:</w:t>
       </w:r>
     </w:p>
     <w:p>
@@ -3547,13 +3831,24 @@
       <w:r>
         <w:rPr>
           <w:rFonts w:ascii="Arial" w:cs="Arial" w:eastAsia="Arial" w:hAnsi="Arial"/>
+          <w:b/>
+          <w:bCs/>
+          <w:color w:val="000000"/>
+          <w:sz w:val="22"/>
+          <w:szCs w:val="22"/>
+        </w:rPr>
+        <w:t xml:space="preserve">Application Enquiry impact:</w:t>
+      </w:r>
+      <w:r>
+        <w:rPr>
+          <w:rFonts w:ascii="Arial" w:cs="Arial" w:eastAsia="Arial" w:hAnsi="Arial"/>
           <w:b w:val="false"/>
           <w:bCs w:val="false"/>
           <w:color w:val="000000"/>
           <w:sz w:val="22"/>
           <w:szCs w:val="22"/>
         </w:rPr>
-        <w:t xml:space="preserve">The application history shows the 'Edit Information' step with the old → new values in the step details, followed by the system steps of the re-run.</w:t>
+        <w:t xml:space="preserve"> the enquiry details display the updated values identically in the same Application Details section, and its Application History shows the 'Edit Information' step with the old → new values in the step details, followed by the system steps of the re-run. No edit is possible from Application Enquiry.</w:t>
       </w:r>
     </w:p>
     <w:p>
@@ -5962,278 +6257,6 @@
           </w:p>
         </w:tc>
       </w:tr>
-      <w:tr>
-        <w:trPr>
-          <w:cantSplit/>
-        </w:trPr>
-        <w:tc>
-          <w:tcPr>
-            <w:tcW w:type="dxa" w:w="1715"/>
-            <w:shd w:fill="FFFFFF" w:color="auto" w:val="clear"/>
-            <w:tcMar>
-              <w:top w:type="dxa" w:w="90"/>
-              <w:left w:type="dxa" w:w="110"/>
-              <w:bottom w:type="dxa" w:w="90"/>
-              <w:right w:type="dxa" w:w="110"/>
-            </w:tcMar>
-            <w:vAlign w:val="top"/>
-          </w:tcPr>
-          <w:p>
-            <w:pPr>
-              <w:spacing w:after="0" w:before="0" w:line="252"/>
-            </w:pPr>
-            <w:r>
-              <w:rPr>
-                <w:rFonts w:ascii="Arial" w:cs="Arial" w:eastAsia="Arial" w:hAnsi="Arial"/>
-                <w:b w:val="false"/>
-                <w:bCs w:val="false"/>
-                <w:color w:val="000000"/>
-                <w:sz w:val="21"/>
-                <w:szCs w:val="21"/>
-              </w:rPr>
-              <w:t xml:space="preserve">Documents</w:t>
-            </w:r>
-          </w:p>
-        </w:tc>
-        <w:tc>
-          <w:tcPr>
-            <w:tcW w:type="dxa" w:w="4062"/>
-            <w:shd w:fill="FFFFFF" w:color="auto" w:val="clear"/>
-            <w:tcMar>
-              <w:top w:type="dxa" w:w="90"/>
-              <w:left w:type="dxa" w:w="110"/>
-              <w:bottom w:type="dxa" w:w="90"/>
-              <w:right w:type="dxa" w:w="110"/>
-            </w:tcMar>
-            <w:vAlign w:val="top"/>
-          </w:tcPr>
-          <w:p>
-            <w:pPr>
-              <w:spacing w:after="0" w:before="0" w:line="252"/>
-            </w:pPr>
-            <w:r>
-              <w:rPr>
-                <w:rFonts w:ascii="Arial" w:cs="Arial" w:eastAsia="Arial" w:hAnsi="Arial"/>
-                <w:b w:val="false"/>
-                <w:bCs w:val="false"/>
-                <w:color w:val="000000"/>
-                <w:sz w:val="21"/>
-                <w:szCs w:val="21"/>
-              </w:rPr>
-              <w:t xml:space="preserve">CAM report and Affordability Assessment Form regenerated on the edit; the Application Form stays the OTP-time record.</w:t>
-            </w:r>
-          </w:p>
-        </w:tc>
-        <w:tc>
-          <w:tcPr>
-            <w:tcW w:type="dxa" w:w="3249"/>
-            <w:tcMar>
-              <w:top w:type="dxa" w:w="90"/>
-              <w:left w:type="dxa" w:w="110"/>
-              <w:bottom w:type="dxa" w:w="90"/>
-              <w:right w:type="dxa" w:w="110"/>
-            </w:tcMar>
-            <w:vAlign w:val="center"/>
-          </w:tcPr>
-          <w:p>
-            <w:pPr>
-              <w:spacing w:after="40" w:before="0"/>
-              <w:jc w:val="center"/>
-            </w:pPr>
-            <w:r>
-              <w:drawing>
-                <wp:inline distT="0" distB="0" distL="0" distR="0">
-                  <wp:extent cx="1809750" cy="809625"/>
-                  <wp:effectExtent t="0" r="0" b="0" l="0"/>
-                  <wp:docPr id="17" name="" descr="" title=""/>
-                  <wp:cNvGraphicFramePr>
-                    <a:graphicFrameLocks xmlns:a="http://schemas.openxmlformats.org/drawingml/2006/main" noChangeAspect="1"/>
-                  </wp:cNvGraphicFramePr>
-                  <a:graphic xmlns:a="http://schemas.openxmlformats.org/drawingml/2006/main">
-                    <a:graphicData uri="http://schemas.openxmlformats.org/drawingml/2006/picture">
-                      <pic:pic xmlns:pic="http://schemas.openxmlformats.org/drawingml/2006/picture">
-                        <pic:nvPicPr>
-                          <pic:cNvPr id="0" name="" descr=""/>
-                          <pic:cNvPicPr>
-                            <a:picLocks noChangeAspect="1" noChangeArrowheads="1"/>
-                          </pic:cNvPicPr>
-                        </pic:nvPicPr>
-                        <pic:blipFill>
-                          <a:blip r:embed="rId25" cstate="none"/>
-                          <a:srcRect/>
-                          <a:stretch>
-                            <a:fillRect/>
-                          </a:stretch>
-                        </pic:blipFill>
-                        <pic:spPr bwMode="auto">
-                          <a:xfrm>
-                            <a:off x="0" y="0"/>
-                            <a:ext cx="1809750" cy="809625"/>
-                          </a:xfrm>
-                          <a:prstGeom prst="rect">
-                            <a:avLst/>
-                          </a:prstGeom>
-                        </pic:spPr>
-                      </pic:pic>
-                    </a:graphicData>
-                  </a:graphic>
-                </wp:inline>
-              </w:drawing>
-            </w:r>
-          </w:p>
-          <w:p>
-            <w:pPr>
-              <w:spacing w:after="0" w:before="0"/>
-              <w:jc w:val="center"/>
-            </w:pPr>
-            <w:r>
-              <w:rPr>
-                <w:rFonts w:ascii="Arial" w:cs="Arial" w:eastAsia="Arial" w:hAnsi="Arial"/>
-                <w:color w:val="595959"/>
-                <w:sz w:val="17"/>
-                <w:szCs w:val="17"/>
-              </w:rPr>
-              <w:t xml:space="preserve">Document generation services</w:t>
-            </w:r>
-          </w:p>
-        </w:tc>
-      </w:tr>
-      <w:tr>
-        <w:trPr>
-          <w:cantSplit/>
-        </w:trPr>
-        <w:tc>
-          <w:tcPr>
-            <w:tcW w:type="dxa" w:w="1715"/>
-            <w:shd w:fill="FFFFFF" w:color="auto" w:val="clear"/>
-            <w:tcMar>
-              <w:top w:type="dxa" w:w="90"/>
-              <w:left w:type="dxa" w:w="110"/>
-              <w:bottom w:type="dxa" w:w="90"/>
-              <w:right w:type="dxa" w:w="110"/>
-            </w:tcMar>
-            <w:vAlign w:val="top"/>
-          </w:tcPr>
-          <w:p>
-            <w:pPr>
-              <w:spacing w:after="0" w:before="0" w:line="252"/>
-            </w:pPr>
-            <w:r>
-              <w:rPr>
-                <w:rFonts w:ascii="Arial" w:cs="Arial" w:eastAsia="Arial" w:hAnsi="Arial"/>
-                <w:b w:val="false"/>
-                <w:bCs w:val="false"/>
-                <w:color w:val="000000"/>
-                <w:sz w:val="21"/>
-                <w:szCs w:val="21"/>
-              </w:rPr>
-              <w:t xml:space="preserve">Status model / mobile app / Communication</w:t>
-            </w:r>
-          </w:p>
-        </w:tc>
-        <w:tc>
-          <w:tcPr>
-            <w:tcW w:type="dxa" w:w="4062"/>
-            <w:shd w:fill="FFFFFF" w:color="auto" w:val="clear"/>
-            <w:tcMar>
-              <w:top w:type="dxa" w:w="90"/>
-              <w:left w:type="dxa" w:w="110"/>
-              <w:bottom w:type="dxa" w:w="90"/>
-              <w:right w:type="dxa" w:w="110"/>
-            </w:tcMar>
-            <w:vAlign w:val="top"/>
-          </w:tcPr>
-          <w:p>
-            <w:pPr>
-              <w:spacing w:after="0" w:before="0" w:line="252"/>
-            </w:pPr>
-            <w:r>
-              <w:rPr>
-                <w:rFonts w:ascii="Arial" w:cs="Arial" w:eastAsia="Arial" w:hAnsi="Arial"/>
-                <w:b w:val="false"/>
-                <w:bCs w:val="false"/>
-                <w:color w:val="000000"/>
-                <w:sz w:val="21"/>
-                <w:szCs w:val="21"/>
-              </w:rPr>
-              <w:t xml:space="preserve">No new Application Status, no mobile-app change, no new email template; the customer is not notified.</w:t>
-            </w:r>
-          </w:p>
-        </w:tc>
-        <w:tc>
-          <w:tcPr>
-            <w:tcW w:type="dxa" w:w="3249"/>
-            <w:tcMar>
-              <w:top w:type="dxa" w:w="90"/>
-              <w:left w:type="dxa" w:w="110"/>
-              <w:bottom w:type="dxa" w:w="90"/>
-              <w:right w:type="dxa" w:w="110"/>
-            </w:tcMar>
-            <w:vAlign w:val="center"/>
-          </w:tcPr>
-          <w:p>
-            <w:pPr>
-              <w:spacing w:after="40" w:before="0"/>
-              <w:jc w:val="center"/>
-            </w:pPr>
-            <w:r>
-              <w:drawing>
-                <wp:inline distT="0" distB="0" distL="0" distR="0">
-                  <wp:extent cx="1809750" cy="514350"/>
-                  <wp:effectExtent t="0" r="0" b="0" l="0"/>
-                  <wp:docPr id="18" name="" descr="" title=""/>
-                  <wp:cNvGraphicFramePr>
-                    <a:graphicFrameLocks xmlns:a="http://schemas.openxmlformats.org/drawingml/2006/main" noChangeAspect="1"/>
-                  </wp:cNvGraphicFramePr>
-                  <a:graphic xmlns:a="http://schemas.openxmlformats.org/drawingml/2006/main">
-                    <a:graphicData uri="http://schemas.openxmlformats.org/drawingml/2006/picture">
-                      <pic:pic xmlns:pic="http://schemas.openxmlformats.org/drawingml/2006/picture">
-                        <pic:nvPicPr>
-                          <pic:cNvPr id="0" name="" descr=""/>
-                          <pic:cNvPicPr>
-                            <a:picLocks noChangeAspect="1" noChangeArrowheads="1"/>
-                          </pic:cNvPicPr>
-                        </pic:nvPicPr>
-                        <pic:blipFill>
-                          <a:blip r:embed="rId26" cstate="none"/>
-                          <a:srcRect/>
-                          <a:stretch>
-                            <a:fillRect/>
-                          </a:stretch>
-                        </pic:blipFill>
-                        <pic:spPr bwMode="auto">
-                          <a:xfrm>
-                            <a:off x="0" y="0"/>
-                            <a:ext cx="1809750" cy="514350"/>
-                          </a:xfrm>
-                          <a:prstGeom prst="rect">
-                            <a:avLst/>
-                          </a:prstGeom>
-                        </pic:spPr>
-                      </pic:pic>
-                    </a:graphicData>
-                  </a:graphic>
-                </wp:inline>
-              </w:drawing>
-            </w:r>
-          </w:p>
-          <w:p>
-            <w:pPr>
-              <w:spacing w:after="0" w:before="0"/>
-              <w:jc w:val="center"/>
-            </w:pPr>
-            <w:r>
-              <w:rPr>
-                <w:rFonts w:ascii="Arial" w:cs="Arial" w:eastAsia="Arial" w:hAnsi="Arial"/>
-                <w:color w:val="595959"/>
-                <w:sz w:val="17"/>
-                <w:szCs w:val="17"/>
-              </w:rPr>
-              <w:t xml:space="preserve">Status unchanged by the edit</w:t>
-            </w:r>
-          </w:p>
-        </w:tc>
-      </w:tr>
     </w:tbl>
     <w:p>
       <w:r>
@@ -6249,7 +6272,7 @@
           <wp:inline distT="0" distB="0" distL="0" distR="0">
             <wp:extent cx="1619250" cy="971550"/>
             <wp:effectExtent t="0" r="0" b="0" l="0"/>
-            <wp:docPr id="19" name="" descr="" title=""/>
+            <wp:docPr id="17" name="" descr="" title=""/>
             <wp:cNvGraphicFramePr>
               <a:graphicFrameLocks xmlns:a="http://schemas.openxmlformats.org/drawingml/2006/main" noChangeAspect="1"/>
             </wp:cNvGraphicFramePr>
@@ -6315,7 +6338,7 @@
           <wp:inline distT="0" distB="0" distL="0" distR="0">
             <wp:extent cx="1905000" cy="552450"/>
             <wp:effectExtent t="0" r="0" b="0" l="0"/>
-            <wp:docPr id="20" name="" descr="" title=""/>
+            <wp:docPr id="18" name="" descr="" title=""/>
             <wp:cNvGraphicFramePr>
               <a:graphicFrameLocks xmlns:a="http://schemas.openxmlformats.org/drawingml/2006/main" noChangeAspect="1"/>
             </wp:cNvGraphicFramePr>
@@ -6405,7 +6428,7 @@
           <wp:inline distT="0" distB="0" distL="0" distR="0">
             <wp:extent cx="5715000" cy="676275"/>
             <wp:effectExtent t="0" r="0" b="0" l="0"/>
-            <wp:docPr id="21" name="" descr="" title=""/>
+            <wp:docPr id="19" name="" descr="" title=""/>
             <wp:cNvGraphicFramePr>
               <a:graphicFrameLocks xmlns:a="http://schemas.openxmlformats.org/drawingml/2006/main" noChangeAspect="1"/>
             </wp:cNvGraphicFramePr>
@@ -6583,7 +6606,7 @@
               <wp:inline distT="0" distB="0" distL="0" distR="0">
                 <wp:extent cx="914400" cy="180975"/>
                 <wp:effectExtent t="0" r="0" b="0" l="0"/>
-                <wp:docPr id="23" name="" descr="" title=""/>
+                <wp:docPr id="21" name="" descr="" title=""/>
                 <wp:cNvGraphicFramePr>
                   <a:graphicFrameLocks xmlns:a="http://schemas.openxmlformats.org/drawingml/2006/main" noChangeAspect="1"/>
                 </wp:cNvGraphicFramePr>
@@ -6716,7 +6739,7 @@
               <wp:inline distT="0" distB="0" distL="0" distR="0">
                 <wp:extent cx="952500" cy="285750"/>
                 <wp:effectExtent t="0" r="0" b="0" l="0"/>
-                <wp:docPr id="22" name="" descr="" title=""/>
+                <wp:docPr id="20" name="" descr="" title=""/>
                 <wp:cNvGraphicFramePr>
                   <a:graphicFrameLocks xmlns:a="http://schemas.openxmlformats.org/drawingml/2006/main" noChangeAspect="1"/>
                 </wp:cNvGraphicFramePr>

</xml_diff>

<commit_message>
RF-3309: generic Edit confirmation message (not field-specific)
Co-Authored-By: Claude Fable 5 <noreply@anthropic.com>
Claude-Session: https://claude.ai/code/session_01DpzepkLYwCzujeEtvjJxcF
</commit_message>
<xml_diff>
--- a/docs/brd/RF-3309/Appro_RF_Employer_Name_Edit_in_Credit_Queue_v1.0.docx
+++ b/docs/brd/RF-3309/Appro_RF_Employer_Name_Edit_in_Credit_Queue_v1.0.docx
@@ -2577,7 +2577,7 @@
           <w:sz w:val="22"/>
           <w:szCs w:val="22"/>
         </w:rPr>
-        <w:t xml:space="preserve">When the user clicks Save, the existing Edit confirmation component is shown once for the whole pop-up (centered message, No / Yes, Save buttons): </w:t>
+        <w:t xml:space="preserve">When the user clicks Save, the existing Edit confirmation component is shown once for the whole pop-up — one generic message, not specific to any edited field (centered message, No / Yes, Save buttons): </w:t>
       </w:r>
       <w:r>
         <w:rPr>
@@ -2588,7 +2588,7 @@
           <w:sz w:val="22"/>
           <w:szCs w:val="22"/>
         </w:rPr>
-        <w:t xml:space="preserve">'Are you sure you want to update this &lt;Application ID&gt;? Company Name will change from "&lt;current&gt;" to "&lt;new&gt;". The system will re-run the ALOC classification, recalculate the related fields and re-run the Rule Engine.'</w:t>
+        <w:t xml:space="preserve">'Are you sure you want to update this &lt;Application ID&gt;? The system will automatically recalculate the related fields and re-run the Rule Engine.'</w:t>
       </w:r>
     </w:p>
     <w:p>

</xml_diff>

<commit_message>
RF-3309: merge Length of Service and Company Name into one Employment Information section
Edit pop-up: Length of Service section renamed Employment Information,
holding Length Of Service (Months) + Company Name; each field governed
by its own permission (permissions stay separate in Role Management).
RE re-run auto-rejection provenance clarified as existing shared-counter
behaviour. SC3 re-rendered; US and BRD aligned.

Co-Authored-By: Claude Fable 5 <noreply@anthropic.com>
Claude-Session: https://claude.ai/code/session_01DpzepkLYwCzujeEtvjJxcF
</commit_message>
<xml_diff>
--- a/docs/brd/RF-3309/Appro_RF_Employer_Name_Edit_in_Credit_Queue_v1.0.docx
+++ b/docs/brd/RF-3309/Appro_RF_Employer_Name_Edit_in_Credit_Queue_v1.0.docx
@@ -628,7 +628,7 @@
           <w:sz w:val="22"/>
           <w:szCs w:val="22"/>
         </w:rPr>
-        <w:t xml:space="preserve">Credit user with the 'Edit Employer Name' permission opens the existing Edit Application pop-up in Credit Queue and corrects the Company Name in the new Employment Information section.</w:t>
+        <w:t xml:space="preserve">Credit user with the 'Edit Employer Name' permission opens the existing Edit Application pop-up in Credit Queue and corrects the Company Name in the Employment Information section (the renamed Length of Service section, now holding both employment fields).</w:t>
       </w:r>
     </w:p>
     <w:p>
@@ -1719,7 +1719,7 @@
           <w:sz w:val="21"/>
           <w:szCs w:val="21"/>
         </w:rPr>
-        <w:t xml:space="preserve">The permission is a distinct right — never bundled with Evaluate Application or Send Application. The Permission Matrix reference page shall be updated.</w:t>
+        <w:t xml:space="preserve">The permission is a distinct right — never bundled with Evaluate Application or Send Application, and it stays separate from 'Edit Length of Service' although both fields sit in the one Employment Information section: each permission governs its own field. The Permission Matrix reference page shall be updated.</w:t>
       </w:r>
     </w:p>
     <w:p>
@@ -1779,7 +1779,7 @@
           <w:sz w:val="22"/>
           <w:szCs w:val="22"/>
         </w:rPr>
-        <w:t xml:space="preserve"> button on the Credit Queue Application Details screen is the entry point. The Edit Application pop-up gains a new section </w:t>
+        <w:t xml:space="preserve"> button on the Credit Queue Application Details screen is the entry point. In the Edit Application pop-up, the existing "Length of Service" section is renamed </w:t>
       </w:r>
       <w:r>
         <w:rPr>
@@ -1801,7 +1801,51 @@
           <w:sz w:val="22"/>
           <w:szCs w:val="22"/>
         </w:rPr>
-        <w:t xml:space="preserve">, placed after Length of Service, holding a single editable field.</w:t>
+        <w:t xml:space="preserve"> and holds both employment fields — </w:t>
+      </w:r>
+      <w:r>
+        <w:rPr>
+          <w:rFonts w:ascii="Arial" w:cs="Arial" w:eastAsia="Arial" w:hAnsi="Arial"/>
+          <w:b/>
+          <w:bCs/>
+          <w:color w:val="000000"/>
+          <w:sz w:val="22"/>
+          <w:szCs w:val="22"/>
+        </w:rPr>
+        <w:t xml:space="preserve">Length Of Service (Months)</w:t>
+      </w:r>
+      <w:r>
+        <w:rPr>
+          <w:rFonts w:ascii="Arial" w:cs="Arial" w:eastAsia="Arial" w:hAnsi="Arial"/>
+          <w:b w:val="false"/>
+          <w:bCs w:val="false"/>
+          <w:color w:val="000000"/>
+          <w:sz w:val="22"/>
+          <w:szCs w:val="22"/>
+        </w:rPr>
+        <w:t xml:space="preserve"> (existing, unchanged) and the new </w:t>
+      </w:r>
+      <w:r>
+        <w:rPr>
+          <w:rFonts w:ascii="Arial" w:cs="Arial" w:eastAsia="Arial" w:hAnsi="Arial"/>
+          <w:b/>
+          <w:bCs/>
+          <w:color w:val="000000"/>
+          <w:sz w:val="22"/>
+          <w:szCs w:val="22"/>
+        </w:rPr>
+        <w:t xml:space="preserve">Company Name</w:t>
+      </w:r>
+      <w:r>
+        <w:rPr>
+          <w:rFonts w:ascii="Arial" w:cs="Arial" w:eastAsia="Arial" w:hAnsi="Arial"/>
+          <w:b w:val="false"/>
+          <w:bCs w:val="false"/>
+          <w:color w:val="000000"/>
+          <w:sz w:val="22"/>
+          <w:szCs w:val="22"/>
+        </w:rPr>
+        <w:t xml:space="preserve">. Pop-up order: Application Details → Other Income And Expenses → Liability Info → Employment Information.</w:t>
       </w:r>
     </w:p>
     <w:p>
@@ -2241,7 +2285,7 @@
                 <w:sz w:val="21"/>
                 <w:szCs w:val="21"/>
               </w:rPr>
-              <w:t xml:space="preserve">Same style as the existing section bars. Shown only when the user's role has 'Edit Employer Name' = TRUE.</w:t>
+              <w:t xml:space="preserve">Renamed from 'Length of Service' — same style and position. Shown when 'Edit Length of Service' or 'Edit Employer Name' is TRUE; each field displays per its own permission.</w:t>
             </w:r>
           </w:p>
         </w:tc>
@@ -2275,6 +2319,156 @@
                 <w:sz w:val="21"/>
                 <w:szCs w:val="21"/>
               </w:rPr>
+              <w:t xml:space="preserve">Length Of Service (Months)</w:t>
+            </w:r>
+          </w:p>
+        </w:tc>
+        <w:tc>
+          <w:tcPr>
+            <w:tcW w:type="dxa" w:w="1083"/>
+            <w:shd w:fill="FFFFFF" w:color="auto" w:val="clear"/>
+            <w:tcMar>
+              <w:top w:type="dxa" w:w="90"/>
+              <w:left w:type="dxa" w:w="110"/>
+              <w:bottom w:type="dxa" w:w="90"/>
+              <w:right w:type="dxa" w:w="110"/>
+            </w:tcMar>
+            <w:vAlign w:val="top"/>
+          </w:tcPr>
+          <w:p>
+            <w:pPr>
+              <w:spacing w:after="0" w:before="0" w:line="252"/>
+            </w:pPr>
+            <w:r>
+              <w:rPr>
+                <w:rFonts w:ascii="Arial" w:cs="Arial" w:eastAsia="Arial" w:hAnsi="Arial"/>
+                <w:b w:val="false"/>
+                <w:bCs w:val="false"/>
+                <w:color w:val="000000"/>
+                <w:sz w:val="21"/>
+                <w:szCs w:val="21"/>
+              </w:rPr>
+              <w:t xml:space="preserve">Input field</w:t>
+            </w:r>
+          </w:p>
+        </w:tc>
+        <w:tc>
+          <w:tcPr>
+            <w:tcW w:type="dxa" w:w="1444"/>
+            <w:shd w:fill="FFFFFF" w:color="auto" w:val="clear"/>
+            <w:tcMar>
+              <w:top w:type="dxa" w:w="90"/>
+              <w:left w:type="dxa" w:w="110"/>
+              <w:bottom w:type="dxa" w:w="90"/>
+              <w:right w:type="dxa" w:w="110"/>
+            </w:tcMar>
+            <w:vAlign w:val="top"/>
+          </w:tcPr>
+          <w:p>
+            <w:pPr>
+              <w:spacing w:after="0" w:before="0" w:line="252"/>
+            </w:pPr>
+            <w:r>
+              <w:rPr>
+                <w:rFonts w:ascii="Arial" w:cs="Arial" w:eastAsia="Arial" w:hAnsi="Arial"/>
+                <w:b w:val="false"/>
+                <w:bCs w:val="false"/>
+                <w:color w:val="000000"/>
+                <w:sz w:val="21"/>
+                <w:szCs w:val="21"/>
+              </w:rPr>
+              <w:t xml:space="preserve">Yes</w:t>
+            </w:r>
+          </w:p>
+        </w:tc>
+        <w:tc>
+          <w:tcPr>
+            <w:tcW w:type="dxa" w:w="1083"/>
+            <w:shd w:fill="FFFFFF" w:color="auto" w:val="clear"/>
+            <w:tcMar>
+              <w:top w:type="dxa" w:w="90"/>
+              <w:left w:type="dxa" w:w="110"/>
+              <w:bottom w:type="dxa" w:w="90"/>
+              <w:right w:type="dxa" w:w="110"/>
+            </w:tcMar>
+            <w:vAlign w:val="top"/>
+          </w:tcPr>
+          <w:p>
+            <w:pPr>
+              <w:spacing w:after="0" w:before="0" w:line="252"/>
+            </w:pPr>
+            <w:r>
+              <w:rPr>
+                <w:rFonts w:ascii="Arial" w:cs="Arial" w:eastAsia="Arial" w:hAnsi="Arial"/>
+                <w:b w:val="false"/>
+                <w:bCs w:val="false"/>
+                <w:color w:val="000000"/>
+                <w:sz w:val="21"/>
+                <w:szCs w:val="21"/>
+              </w:rPr>
+              <w:t xml:space="preserve">Yes</w:t>
+            </w:r>
+          </w:p>
+        </w:tc>
+        <w:tc>
+          <w:tcPr>
+            <w:tcW w:type="dxa" w:w="3972"/>
+            <w:shd w:fill="FFFFFF" w:color="auto" w:val="clear"/>
+            <w:tcMar>
+              <w:top w:type="dxa" w:w="90"/>
+              <w:left w:type="dxa" w:w="110"/>
+              <w:bottom w:type="dxa" w:w="90"/>
+              <w:right w:type="dxa" w:w="110"/>
+            </w:tcMar>
+            <w:vAlign w:val="top"/>
+          </w:tcPr>
+          <w:p>
+            <w:pPr>
+              <w:spacing w:after="0" w:before="0" w:line="252"/>
+            </w:pPr>
+            <w:r>
+              <w:rPr>
+                <w:rFonts w:ascii="Arial" w:cs="Arial" w:eastAsia="Arial" w:hAnsi="Arial"/>
+                <w:b w:val="false"/>
+                <w:bCs w:val="false"/>
+                <w:color w:val="000000"/>
+                <w:sz w:val="21"/>
+                <w:szCs w:val="21"/>
+              </w:rPr>
+              <w:t xml:space="preserve">Existing field, behaviour unchanged; governed by the existing 'Edit Length of Service' permission.</w:t>
+            </w:r>
+          </w:p>
+        </w:tc>
+      </w:tr>
+      <w:tr>
+        <w:trPr>
+          <w:cantSplit/>
+        </w:trPr>
+        <w:tc>
+          <w:tcPr>
+            <w:tcW w:type="dxa" w:w="1444"/>
+            <w:shd w:fill="FFFFFF" w:color="auto" w:val="clear"/>
+            <w:tcMar>
+              <w:top w:type="dxa" w:w="90"/>
+              <w:left w:type="dxa" w:w="110"/>
+              <w:bottom w:type="dxa" w:w="90"/>
+              <w:right w:type="dxa" w:w="110"/>
+            </w:tcMar>
+            <w:vAlign w:val="top"/>
+          </w:tcPr>
+          <w:p>
+            <w:pPr>
+              <w:spacing w:after="0" w:before="0" w:line="252"/>
+            </w:pPr>
+            <w:r>
+              <w:rPr>
+                <w:rFonts w:ascii="Arial" w:cs="Arial" w:eastAsia="Arial" w:hAnsi="Arial"/>
+                <w:b w:val="false"/>
+                <w:bCs w:val="false"/>
+                <w:color w:val="000000"/>
+                <w:sz w:val="21"/>
+                <w:szCs w:val="21"/>
+              </w:rPr>
               <w:t xml:space="preserve">Company Name</w:t>
             </w:r>
           </w:p>
@@ -2391,7 +2585,7 @@
                 <w:sz w:val="21"/>
                 <w:szCs w:val="21"/>
               </w:rPr>
-              <w:t xml:space="preserve">The only field of the section. Pre-populated with the current finalized Employer Name. Validation as the customer journey field: alphabetic characters only; maximum 200 characters; blank not allowed. An unchanged value on Save does not trigger the re-run.</w:t>
+              <w:t xml:space="preserve">New field, governed by 'Edit Employer Name'. Pre-populated with the current finalized Employer Name. Validation as the customer journey field: alphabetic characters only; maximum 200 characters; blank not allowed. An unchanged value on Save does not trigger the re-run.</w:t>
             </w:r>
           </w:p>
         </w:tc>
@@ -2995,7 +3189,7 @@
                 <w:sz w:val="21"/>
                 <w:szCs w:val="21"/>
               </w:rPr>
-              <w:t xml:space="preserve">Re-run the Rule Engine (segmentation, filtration, deviation) on the currently published versions. The shared re-run counter applies; more than 2 Rule Engine failures reject the application.</w:t>
+              <w:t xml:space="preserve">Re-run the Rule Engine (segmentation, filtration, deviation) on the currently published versions. The existing shared re-run counter applies — the same rule as every edit action that re-triggers the Rule Engine (Edit Information, Re-fetch ECB, Retrigger FTS): if the application fails the Rule Engine more than 2 times in total, the system rejects it. Existing platform behaviour, unchanged by this feature.</w:t>
             </w:r>
           </w:p>
         </w:tc>

</xml_diff>

<commit_message>
RF-3309: final review round — real Application Enquiry base, trail in history only
Permission listed immediately before Edit Length of Service (SC1);
Company Name placed before Length Of Service in the pop-up (SC3);
Employer Name Update block removed from Application Details (details
only — trail lives in the Application Enquiry history, SC6 re-based on
the real enquiry capture with the new step-detail format); source value
Credit Department (AECB verified not a source of the finalized name);
Termination Queue / Disbursement Maker-Checker views called out.

Co-Authored-By: Claude Fable 5 <noreply@anthropic.com>
Claude-Session: https://claude.ai/code/session_01DpzepkLYwCzujeEtvjJxcF
</commit_message>
<xml_diff>
--- a/docs/brd/RF-3309/Appro_RF_Employer_Name_Edit_in_Credit_Queue_v1.0.docx
+++ b/docs/brd/RF-3309/Appro_RF_Employer_Name_Edit_in_Credit_Queue_v1.0.docx
@@ -1430,7 +1430,29 @@
           <w:sz w:val="22"/>
           <w:szCs w:val="22"/>
         </w:rPr>
-        <w:t xml:space="preserve"> under the Manually Queue section of Role Management — per product tab ([Credit Card] / [Personal Loan]), alongside the existing Edit permissions and with the same product-tab treatment as 'Edit Length of Service'.</w:t>
+        <w:t xml:space="preserve"> under the Manually Queue section of Role Management — per product tab ([Credit Card] / [Personal Loan]), listed </w:t>
+      </w:r>
+      <w:r>
+        <w:rPr>
+          <w:rFonts w:ascii="Arial" w:cs="Arial" w:eastAsia="Arial" w:hAnsi="Arial"/>
+          <w:b/>
+          <w:bCs/>
+          <w:color w:val="000000"/>
+          <w:sz w:val="22"/>
+          <w:szCs w:val="22"/>
+        </w:rPr>
+        <w:t xml:space="preserve">immediately before 'Edit Length of Service'</w:t>
+      </w:r>
+      <w:r>
+        <w:rPr>
+          <w:rFonts w:ascii="Arial" w:cs="Arial" w:eastAsia="Arial" w:hAnsi="Arial"/>
+          <w:b w:val="false"/>
+          <w:bCs w:val="false"/>
+          <w:color w:val="000000"/>
+          <w:sz w:val="22"/>
+          <w:szCs w:val="22"/>
+        </w:rPr>
+        <w:t xml:space="preserve"> and with the same product-tab treatment.</w:t>
       </w:r>
     </w:p>
     <w:p>
@@ -1801,7 +1823,7 @@
           <w:sz w:val="22"/>
           <w:szCs w:val="22"/>
         </w:rPr>
-        <w:t xml:space="preserve"> and holds both employment fields — </w:t>
+        <w:t xml:space="preserve"> and holds both employment fields — the new </w:t>
       </w:r>
       <w:r>
         <w:rPr>
@@ -1812,7 +1834,7 @@
           <w:sz w:val="22"/>
           <w:szCs w:val="22"/>
         </w:rPr>
-        <w:t xml:space="preserve">Length Of Service (Months)</w:t>
+        <w:t xml:space="preserve">Company Name</w:t>
       </w:r>
       <w:r>
         <w:rPr>
@@ -1823,7 +1845,7 @@
           <w:sz w:val="22"/>
           <w:szCs w:val="22"/>
         </w:rPr>
-        <w:t xml:space="preserve"> (existing, unchanged) and the new </w:t>
+        <w:t xml:space="preserve"> followed by </w:t>
       </w:r>
       <w:r>
         <w:rPr>
@@ -1834,7 +1856,7 @@
           <w:sz w:val="22"/>
           <w:szCs w:val="22"/>
         </w:rPr>
-        <w:t xml:space="preserve">Company Name</w:t>
+        <w:t xml:space="preserve">Length Of Service (Months)</w:t>
       </w:r>
       <w:r>
         <w:rPr>
@@ -1845,7 +1867,7 @@
           <w:sz w:val="22"/>
           <w:szCs w:val="22"/>
         </w:rPr>
-        <w:t xml:space="preserve">. Pop-up order: Application Details → Other Income And Expenses → Liability Info → Employment Information.</w:t>
+        <w:t xml:space="preserve"> (existing, unchanged). Pop-up order: Application Details → Other Income And Expenses → Liability Info → Employment Information.</w:t>
       </w:r>
     </w:p>
     <w:p>
@@ -2319,156 +2341,6 @@
                 <w:sz w:val="21"/>
                 <w:szCs w:val="21"/>
               </w:rPr>
-              <w:t xml:space="preserve">Length Of Service (Months)</w:t>
-            </w:r>
-          </w:p>
-        </w:tc>
-        <w:tc>
-          <w:tcPr>
-            <w:tcW w:type="dxa" w:w="1083"/>
-            <w:shd w:fill="FFFFFF" w:color="auto" w:val="clear"/>
-            <w:tcMar>
-              <w:top w:type="dxa" w:w="90"/>
-              <w:left w:type="dxa" w:w="110"/>
-              <w:bottom w:type="dxa" w:w="90"/>
-              <w:right w:type="dxa" w:w="110"/>
-            </w:tcMar>
-            <w:vAlign w:val="top"/>
-          </w:tcPr>
-          <w:p>
-            <w:pPr>
-              <w:spacing w:after="0" w:before="0" w:line="252"/>
-            </w:pPr>
-            <w:r>
-              <w:rPr>
-                <w:rFonts w:ascii="Arial" w:cs="Arial" w:eastAsia="Arial" w:hAnsi="Arial"/>
-                <w:b w:val="false"/>
-                <w:bCs w:val="false"/>
-                <w:color w:val="000000"/>
-                <w:sz w:val="21"/>
-                <w:szCs w:val="21"/>
-              </w:rPr>
-              <w:t xml:space="preserve">Input field</w:t>
-            </w:r>
-          </w:p>
-        </w:tc>
-        <w:tc>
-          <w:tcPr>
-            <w:tcW w:type="dxa" w:w="1444"/>
-            <w:shd w:fill="FFFFFF" w:color="auto" w:val="clear"/>
-            <w:tcMar>
-              <w:top w:type="dxa" w:w="90"/>
-              <w:left w:type="dxa" w:w="110"/>
-              <w:bottom w:type="dxa" w:w="90"/>
-              <w:right w:type="dxa" w:w="110"/>
-            </w:tcMar>
-            <w:vAlign w:val="top"/>
-          </w:tcPr>
-          <w:p>
-            <w:pPr>
-              <w:spacing w:after="0" w:before="0" w:line="252"/>
-            </w:pPr>
-            <w:r>
-              <w:rPr>
-                <w:rFonts w:ascii="Arial" w:cs="Arial" w:eastAsia="Arial" w:hAnsi="Arial"/>
-                <w:b w:val="false"/>
-                <w:bCs w:val="false"/>
-                <w:color w:val="000000"/>
-                <w:sz w:val="21"/>
-                <w:szCs w:val="21"/>
-              </w:rPr>
-              <w:t xml:space="preserve">Yes</w:t>
-            </w:r>
-          </w:p>
-        </w:tc>
-        <w:tc>
-          <w:tcPr>
-            <w:tcW w:type="dxa" w:w="1083"/>
-            <w:shd w:fill="FFFFFF" w:color="auto" w:val="clear"/>
-            <w:tcMar>
-              <w:top w:type="dxa" w:w="90"/>
-              <w:left w:type="dxa" w:w="110"/>
-              <w:bottom w:type="dxa" w:w="90"/>
-              <w:right w:type="dxa" w:w="110"/>
-            </w:tcMar>
-            <w:vAlign w:val="top"/>
-          </w:tcPr>
-          <w:p>
-            <w:pPr>
-              <w:spacing w:after="0" w:before="0" w:line="252"/>
-            </w:pPr>
-            <w:r>
-              <w:rPr>
-                <w:rFonts w:ascii="Arial" w:cs="Arial" w:eastAsia="Arial" w:hAnsi="Arial"/>
-                <w:b w:val="false"/>
-                <w:bCs w:val="false"/>
-                <w:color w:val="000000"/>
-                <w:sz w:val="21"/>
-                <w:szCs w:val="21"/>
-              </w:rPr>
-              <w:t xml:space="preserve">Yes</w:t>
-            </w:r>
-          </w:p>
-        </w:tc>
-        <w:tc>
-          <w:tcPr>
-            <w:tcW w:type="dxa" w:w="3972"/>
-            <w:shd w:fill="FFFFFF" w:color="auto" w:val="clear"/>
-            <w:tcMar>
-              <w:top w:type="dxa" w:w="90"/>
-              <w:left w:type="dxa" w:w="110"/>
-              <w:bottom w:type="dxa" w:w="90"/>
-              <w:right w:type="dxa" w:w="110"/>
-            </w:tcMar>
-            <w:vAlign w:val="top"/>
-          </w:tcPr>
-          <w:p>
-            <w:pPr>
-              <w:spacing w:after="0" w:before="0" w:line="252"/>
-            </w:pPr>
-            <w:r>
-              <w:rPr>
-                <w:rFonts w:ascii="Arial" w:cs="Arial" w:eastAsia="Arial" w:hAnsi="Arial"/>
-                <w:b w:val="false"/>
-                <w:bCs w:val="false"/>
-                <w:color w:val="000000"/>
-                <w:sz w:val="21"/>
-                <w:szCs w:val="21"/>
-              </w:rPr>
-              <w:t xml:space="preserve">Existing field, behaviour unchanged; governed by the existing 'Edit Length of Service' permission.</w:t>
-            </w:r>
-          </w:p>
-        </w:tc>
-      </w:tr>
-      <w:tr>
-        <w:trPr>
-          <w:cantSplit/>
-        </w:trPr>
-        <w:tc>
-          <w:tcPr>
-            <w:tcW w:type="dxa" w:w="1444"/>
-            <w:shd w:fill="FFFFFF" w:color="auto" w:val="clear"/>
-            <w:tcMar>
-              <w:top w:type="dxa" w:w="90"/>
-              <w:left w:type="dxa" w:w="110"/>
-              <w:bottom w:type="dxa" w:w="90"/>
-              <w:right w:type="dxa" w:w="110"/>
-            </w:tcMar>
-            <w:vAlign w:val="top"/>
-          </w:tcPr>
-          <w:p>
-            <w:pPr>
-              <w:spacing w:after="0" w:before="0" w:line="252"/>
-            </w:pPr>
-            <w:r>
-              <w:rPr>
-                <w:rFonts w:ascii="Arial" w:cs="Arial" w:eastAsia="Arial" w:hAnsi="Arial"/>
-                <w:b w:val="false"/>
-                <w:bCs w:val="false"/>
-                <w:color w:val="000000"/>
-                <w:sz w:val="21"/>
-                <w:szCs w:val="21"/>
-              </w:rPr>
               <w:t xml:space="preserve">Company Name</w:t>
             </w:r>
           </w:p>
@@ -3000,7 +2872,7 @@
                 <w:sz w:val="21"/>
                 <w:szCs w:val="21"/>
               </w:rPr>
-              <w:t xml:space="preserve">Override the finalized Employer Name with the input. The first system-derived value is kept as the Original Employer Name together with its original classification. Source is recorded as 'Credit User' with Updated By / Updated On. The government-record and customer-journey source data are not modified.</w:t>
+              <w:t xml:space="preserve">Override the finalized Employer Name with the input. The first system-derived value is kept as the Original Employer Name together with its original classification. Source is recorded as 'Credit Department' with Updated By / Updated On. The government-record and customer-journey source data are not modified.</w:t>
             </w:r>
           </w:p>
         </w:tc>
@@ -3315,7 +3187,7 @@
                 <w:sz w:val="21"/>
                 <w:szCs w:val="21"/>
               </w:rPr>
-              <w:t xml:space="preserve">Audit trail: Step = 'Edit Information'; Step Detail = 'Employer Name updated from "&lt;old&gt;" to "&lt;new&gt;" by %Username%. Classification: &lt;original&gt; → &lt;updated&gt;'; Action by = user email.</w:t>
+              <w:t xml:space="preserve">Audit trail: Step = 'Edit Information'; Step Detail = 'Employer Name updated from "&lt;old&gt;" (Source: &lt;old source&gt;) to "&lt;new&gt;". ALOC updated from &lt;original ALOC&gt; to &lt;updated ALOC&gt;.'; Action by = user email. This step is the traceability record — the old → new trail lives in the application history, not in the Application Details display.</w:t>
             </w:r>
           </w:p>
         </w:tc>
@@ -3568,7 +3440,7 @@
           <w:sz w:val="22"/>
           <w:szCs w:val="22"/>
         </w:rPr>
-        <w:t xml:space="preserve"> sub-block of the application view. The same section is shown in </w:t>
+        <w:t xml:space="preserve"> sub-block of the application view. </w:t>
       </w:r>
       <w:r>
         <w:rPr>
@@ -3579,7 +3451,7 @@
           <w:sz w:val="22"/>
           <w:szCs w:val="22"/>
         </w:rPr>
-        <w:t xml:space="preserve">Credit Queue L1–L3, Risk Queue, Sale Queue, Compliance Queue and Application Enquiry</w:t>
+        <w:t xml:space="preserve">Application Details displays details only — no trail block</w:t>
       </w:r>
       <w:r>
         <w:rPr>
@@ -3590,7 +3462,29 @@
           <w:sz w:val="22"/>
           <w:szCs w:val="22"/>
         </w:rPr>
-        <w:t xml:space="preserve"> (view only) — the Edit pop-up carries only the editable field; the full picture is view-only here:</w:t>
+        <w:t xml:space="preserve">; the old → new trail lives in the Application Enquiry application history (section 3, step 6). The same section is shown, reading the finalized value, in every view that renders it: </w:t>
+      </w:r>
+      <w:r>
+        <w:rPr>
+          <w:rFonts w:ascii="Arial" w:cs="Arial" w:eastAsia="Arial" w:hAnsi="Arial"/>
+          <w:b/>
+          <w:bCs/>
+          <w:color w:val="000000"/>
+          <w:sz w:val="22"/>
+          <w:szCs w:val="22"/>
+        </w:rPr>
+        <w:t xml:space="preserve">Credit Queue L1–L3, Risk Queue, Sale Queue, Compliance Queue, Termination Queue, Disbursement Maker / Checker and Application Enquiry</w:t>
+      </w:r>
+      <w:r>
+        <w:rPr>
+          <w:rFonts w:ascii="Arial" w:cs="Arial" w:eastAsia="Arial" w:hAnsi="Arial"/>
+          <w:b w:val="false"/>
+          <w:bCs w:val="false"/>
+          <w:color w:val="000000"/>
+          <w:sz w:val="22"/>
+          <w:szCs w:val="22"/>
+        </w:rPr>
+        <w:t xml:space="preserve"> (all view only):</w:t>
       </w:r>
     </w:p>
     <w:p>
@@ -3855,7 +3749,7 @@
                 <w:sz w:val="21"/>
                 <w:szCs w:val="21"/>
               </w:rPr>
-              <w:t xml:space="preserve">EFR (Sponsor Name) | Customer Journey | Credit User</w:t>
+              <w:t xml:space="preserve">EFR (Sponsor Name) | Customer Journey | Credit Department (after an edit). AECB is not a source of the finalized Employer Name — the AECB employment-history name is used only for the cross-match inside the Length of Service logic (verified).</w:t>
             </w:r>
           </w:p>
         </w:tc>
@@ -3919,69 +3813,6 @@
                 <w:szCs w:val="21"/>
               </w:rPr>
               <w:t xml:space="preserve">Re-classified result in the live display format: Yes | No (&lt;match %&gt;)</w:t>
-            </w:r>
-          </w:p>
-        </w:tc>
-      </w:tr>
-      <w:tr>
-        <w:trPr>
-          <w:cantSplit/>
-        </w:trPr>
-        <w:tc>
-          <w:tcPr>
-            <w:tcW w:type="dxa" w:w="3069"/>
-            <w:shd w:fill="FFFFFF" w:color="auto" w:val="clear"/>
-            <w:tcMar>
-              <w:top w:type="dxa" w:w="90"/>
-              <w:left w:type="dxa" w:w="110"/>
-              <w:bottom w:type="dxa" w:w="90"/>
-              <w:right w:type="dxa" w:w="110"/>
-            </w:tcMar>
-            <w:vAlign w:val="top"/>
-          </w:tcPr>
-          <w:p>
-            <w:pPr>
-              <w:spacing w:after="0" w:before="0" w:line="252"/>
-            </w:pPr>
-            <w:r>
-              <w:rPr>
-                <w:rFonts w:ascii="Arial" w:cs="Arial" w:eastAsia="Arial" w:hAnsi="Arial"/>
-                <w:b w:val="false"/>
-                <w:bCs w:val="false"/>
-                <w:color w:val="000000"/>
-                <w:sz w:val="21"/>
-                <w:szCs w:val="21"/>
-              </w:rPr>
-              <w:t xml:space="preserve">Employer Name Update (new sub-block, shown only after an edit)</w:t>
-            </w:r>
-          </w:p>
-        </w:tc>
-        <w:tc>
-          <w:tcPr>
-            <w:tcW w:type="dxa" w:w="5957"/>
-            <w:shd w:fill="FFFFFF" w:color="auto" w:val="clear"/>
-            <w:tcMar>
-              <w:top w:type="dxa" w:w="90"/>
-              <w:left w:type="dxa" w:w="110"/>
-              <w:bottom w:type="dxa" w:w="90"/>
-              <w:right w:type="dxa" w:w="110"/>
-            </w:tcMar>
-            <w:vAlign w:val="top"/>
-          </w:tcPr>
-          <w:p>
-            <w:pPr>
-              <w:spacing w:after="0" w:before="0" w:line="252"/>
-            </w:pPr>
-            <w:r>
-              <w:rPr>
-                <w:rFonts w:ascii="Arial" w:cs="Arial" w:eastAsia="Arial" w:hAnsi="Arial"/>
-                <w:b w:val="false"/>
-                <w:bCs w:val="false"/>
-                <w:color w:val="000000"/>
-                <w:sz w:val="21"/>
-                <w:szCs w:val="21"/>
-              </w:rPr>
-              <w:t xml:space="preserve">Original Company Name · Original ALOC · Updated Company Name · Updated ALOC · Updated By · Updated On</w:t>
             </w:r>
           </w:p>
         </w:tc>
@@ -4010,7 +3841,7 @@
           <w:sz w:val="22"/>
           <w:szCs w:val="22"/>
         </w:rPr>
-        <w:t xml:space="preserve">Repeat edits: the block keeps the first original and the latest updated value; the intermediate values are in the application history.</w:t>
+        <w:t xml:space="preserve">Repeat edits: every edit writes its own Edit Information step — the application history carries the full trail.</w:t>
       </w:r>
     </w:p>
     <w:p>
@@ -4248,7 +4079,7 @@
                 <w:sz w:val="21"/>
                 <w:szCs w:val="21"/>
               </w:rPr>
-              <w:t xml:space="preserve">Application details (all queues + Application Enquiry)</w:t>
+              <w:t xml:space="preserve">Application details — every view that renders it (Credit / Risk / Sale / Compliance queues, Termination Queue, Disbursement Maker / Checker, Application Enquiry)</w:t>
             </w:r>
           </w:p>
         </w:tc>
@@ -4277,7 +4108,7 @@
                 <w:sz w:val="21"/>
                 <w:szCs w:val="21"/>
               </w:rPr>
-              <w:t xml:space="preserve">Updated name, re-classified ALOC and the Employer Name Update trail — section 4.</w:t>
+              <w:t xml:space="preserve">Updated name and re-classified ALOC — section 4. No change needed per view: they all read the finalized value.</w:t>
             </w:r>
           </w:p>
         </w:tc>
@@ -6237,7 +6068,7 @@
                 <w:sz w:val="21"/>
                 <w:szCs w:val="21"/>
               </w:rPr>
-              <w:t xml:space="preserve">Company Name Source row and the Employer Name Update block on all queue and enquiry views; classification fields refreshed.</w:t>
+              <w:t xml:space="preserve">Company Name Source row on every view rendering the section (queues including Termination / Disbursement, Application Enquiry); classification fields refreshed. No trail block — the trail is in the application history only.</w:t>
             </w:r>
           </w:p>
         </w:tc>

</xml_diff>

<commit_message>
RF-3309: Role Management per live design — no product classification
SC1 rebuilt on the real Role Management capture (single permission list
per queue level, checkbox sprite from the base, Edit Employer Name
inserted immediately before Edit Length of Service); product-tab wording
removed from US and BRD; ia_role_cq re-cropped; zip refreshed.

Co-Authored-By: Claude Fable 5 <noreply@anthropic.com>
Claude-Session: https://claude.ai/code/session_01DpzepkLYwCzujeEtvjJxcF
</commit_message>
<xml_diff>
--- a/docs/brd/RF-3309/Appro_RF_Employer_Name_Edit_in_Credit_Queue_v1.0.docx
+++ b/docs/brd/RF-3309/Appro_RF_Employer_Name_Edit_in_Credit_Queue_v1.0.docx
@@ -1430,7 +1430,7 @@
           <w:sz w:val="22"/>
           <w:szCs w:val="22"/>
         </w:rPr>
-        <w:t xml:space="preserve"> under the Manually Queue section of Role Management — per product tab ([Credit Card] / [Personal Loan]), listed </w:t>
+        <w:t xml:space="preserve"> under the Manually Queue section of Role Management — </w:t>
       </w:r>
       <w:r>
         <w:rPr>
@@ -1441,7 +1441,7 @@
           <w:sz w:val="22"/>
           <w:szCs w:val="22"/>
         </w:rPr>
-        <w:t xml:space="preserve">immediately before 'Edit Length of Service'</w:t>
+        <w:t xml:space="preserve">no product classification</w:t>
       </w:r>
       <w:r>
         <w:rPr>
@@ -1452,7 +1452,29 @@
           <w:sz w:val="22"/>
           <w:szCs w:val="22"/>
         </w:rPr>
-        <w:t xml:space="preserve"> and with the same product-tab treatment.</w:t>
+        <w:t xml:space="preserve">: one permission per queue level, per the live Role Management design — listed </w:t>
+      </w:r>
+      <w:r>
+        <w:rPr>
+          <w:rFonts w:ascii="Arial" w:cs="Arial" w:eastAsia="Arial" w:hAnsi="Arial"/>
+          <w:b/>
+          <w:bCs/>
+          <w:color w:val="000000"/>
+          <w:sz w:val="22"/>
+          <w:szCs w:val="22"/>
+        </w:rPr>
+        <w:t xml:space="preserve">immediately before 'Edit Length of Service'</w:t>
+      </w:r>
+      <w:r>
+        <w:rPr>
+          <w:rFonts w:ascii="Arial" w:cs="Arial" w:eastAsia="Arial" w:hAnsi="Arial"/>
+          <w:b w:val="false"/>
+          <w:bCs w:val="false"/>
+          <w:color w:val="000000"/>
+          <w:sz w:val="22"/>
+          <w:szCs w:val="22"/>
+        </w:rPr>
+        <w:t xml:space="preserve"> and with the same treatment.</w:t>
       </w:r>
     </w:p>
     <w:p>
@@ -1625,7 +1647,7 @@
                 <w:sz w:val="21"/>
                 <w:szCs w:val="21"/>
               </w:rPr>
-              <w:t xml:space="preserve">[Product] Edit Employer Name = TRUE</w:t>
+              <w:t xml:space="preserve">Edit Employer Name = TRUE</w:t>
             </w:r>
           </w:p>
         </w:tc>
@@ -1654,7 +1676,7 @@
                 <w:sz w:val="21"/>
                 <w:szCs w:val="21"/>
               </w:rPr>
-              <w:t xml:space="preserve">Users can view and update the Employment Information section of the Edit Application pop-up for that product.</w:t>
+              <w:t xml:space="preserve">Users can view and update the Company Name field of the Employment Information section in the Edit Application pop-up.</w:t>
             </w:r>
           </w:p>
         </w:tc>
@@ -1688,7 +1710,7 @@
                 <w:sz w:val="21"/>
                 <w:szCs w:val="21"/>
               </w:rPr>
-              <w:t xml:space="preserve">[Product] Edit Employer Name = FALSE</w:t>
+              <w:t xml:space="preserve">Edit Employer Name = FALSE</w:t>
             </w:r>
           </w:p>
         </w:tc>
@@ -1717,7 +1739,7 @@
                 <w:sz w:val="21"/>
                 <w:szCs w:val="21"/>
               </w:rPr>
-              <w:t xml:space="preserve">The Employment Information section is hidden. A role with all Edit permissions FALSE does not see the Edit button.</w:t>
+              <w:t xml:space="preserve">The Company Name field is hidden (the section is hidden when Edit Length of Service is FALSE too). A role with all Edit permissions FALSE does not see the Edit button.</w:t>
             </w:r>
           </w:p>
         </w:tc>
@@ -5568,7 +5590,7 @@
                 <w:sz w:val="21"/>
                 <w:szCs w:val="21"/>
               </w:rPr>
-              <w:t xml:space="preserve">New permission 'Edit Employer Name' on Credit Queue L1–L3 (Editor group, per product tab). A distinct right, never bundled. Permission Matrix page updated.</w:t>
+              <w:t xml:space="preserve">New permission 'Edit Employer Name' on Credit Queue L1–L3 (Editor group; one permission per queue level, no product classification). A distinct right, never bundled. Permission Matrix page updated.</w:t>
             </w:r>
           </w:p>
         </w:tc>

</xml_diff>